<commit_message>
Fix DOIs of prior preprints in continuation line and references
P2 (Fisher Information Threshold Study): 19391582 -> 19394880
P3 (LLM Grammar Fingerprinting): 19454201 -> 19461103
P5 (Exponential Relaxation of Fisher Path Speed): add 19519454

Affected files: paper markdown source, compiled docx, and Zenodo metadata template.
</commit_message>
<xml_diff>
--- a/eeg/paper/EEG_Grammar_Fingerprinting.docx
+++ b/eeg/paper/EEG_Grammar_Fingerprinting.docx
@@ -27,7 +27,7 @@
           <w:i/>
           <w:sz w:val="18"/>
         </w:rPr>
-        <w:t>Continuation of Grammar Fingerprinting (doi:10.5281/zenodo.19158088), Fisher Information Threshold Study (doi:10.5281/zenodo.19391582), LLM Grammar Fingerprinting (doi:10.5281/zenodo.19454201), Curvature at the Fisher Threshold (Research Note, April 2026), Exponential Relaxation of Fisher Path Speed (May 2026)</w:t>
+        <w:t>Continuation of Grammar Fingerprinting (doi:10.5281/zenodo.19158088), Fisher Information Threshold Study (doi:10.5281/zenodo.19394880), LLM Grammar Fingerprinting (doi:10.5281/zenodo.19461103), Curvature at the Fisher Threshold (Research Note, April 2026), Exponential Relaxation of Fisher Path Speed (doi:10.5281/zenodo.19519454)</w:t>
       </w:r>
     </w:p>
     <w:p>
@@ -1501,7 +1501,7 @@
         <w:rPr>
           <w:sz w:val="20"/>
         </w:rPr>
-        <w:t>Csaplár, D. (2026b). Fisher Information Threshold Study: Grammar Fingerprinting on Google Sycamore. Zenodo. doi:10.5281/zenodo.19391582.</w:t>
+        <w:t>Csaplár, D. (2026b). Fisher Information Threshold Study: Grammar Fingerprinting on Google Sycamore. Zenodo. doi:10.5281/zenodo.19394880.</w:t>
       </w:r>
     </w:p>
     <w:p>
@@ -1513,7 +1513,7 @@
         <w:rPr>
           <w:sz w:val="20"/>
         </w:rPr>
-        <w:t>Csaplár, D. (2026c). Grammar Fingerprinting and Fisher Information Thresholds in Large Language Model Entropy Series. Zenodo. doi:10.5281/zenodo.19454201.</w:t>
+        <w:t>Csaplár, D. (2026c). Grammar Fingerprinting and Fisher Information Thresholds in Large Language Model Entropy Series. Zenodo. doi:10.5281/zenodo.19461103.</w:t>
       </w:r>
     </w:p>
     <w:p>
@@ -1537,7 +1537,7 @@
         <w:rPr>
           <w:sz w:val="20"/>
         </w:rPr>
-        <w:t>Csaplár, D. (2026e). Exponential Relaxation of Fisher Path Speed on the Statistical Manifold of Learned Transition Matrices. Zenodo (May 2026).</w:t>
+        <w:t>Csaplár, D. (2026e). Exponential Relaxation of Fisher Path Speed on the Statistical Manifold of Learned Transition Matrices. Zenodo. doi:10.5281/zenodo.19519454.</w:t>
       </w:r>
     </w:p>
     <w:p>

</xml_diff>